<commit_message>
feat: add required nationality field to resume form
- 出生日期列新增「國籍」欄位
- 必填僅在一般使用者預覽/送出時驗證（requireNationality: !isAdmin）；
  管理員匯出/列印舊履歷不受影響，空國籍照常匯出
- 更新 Word 範本（評點製_人事資料表.docx）與 .docx 填值（第1列 cell[5]）
- EditMode/PreviewMode 同步顯示，admin 編輯與檢視沿用同元件自動帶入

Co-Authored-By: Claude Opus 4.8 (1M context) <noreply@anthropic.com>
</commit_message>
<xml_diff>
--- a/public/評點製_人事資料表.docx
+++ b/public/評點製_人事資料表.docx
@@ -1,12 +1,13 @@
 
 <file path=word/document.xml><?xml version="1.0" encoding="utf-8"?>
-<w:document xmlns:wpc="http://schemas.microsoft.com/office/word/2010/wordprocessingCanvas" xmlns:cx="http://schemas.microsoft.com/office/drawing/2014/chartex" xmlns:cx1="http://schemas.microsoft.com/office/drawing/2015/9/8/chartex" xmlns:cx2="http://schemas.microsoft.com/office/drawing/2015/10/21/chartex" xmlns:cx3="http://schemas.microsoft.com/office/drawing/2016/5/9/chartex" xmlns:cx4="http://schemas.microsoft.com/office/drawing/2016/5/10/chartex" xmlns:cx5="http://schemas.microsoft.com/office/drawing/2016/5/11/chartex" xmlns:cx6="http://schemas.microsoft.com/office/drawing/2016/5/12/chartex" xmlns:cx7="http://schemas.microsoft.com/office/drawing/2016/5/13/chartex" xmlns:cx8="http://schemas.microsoft.com/office/drawing/2016/5/14/chartex" xmlns:mc="http://schemas.openxmlformats.org/markup-compatibility/2006" xmlns:aink="http://schemas.microsoft.com/office/drawing/2016/ink" xmlns:am3d="http://schemas.microsoft.com/office/drawing/2017/model3d" xmlns:o="urn:schemas-microsoft-com:office:office" xmlns:oel="http://schemas.microsoft.com/office/2019/extlst" xmlns:r="http://schemas.openxmlformats.org/officeDocument/2006/relationships" xmlns:m="http://schemas.openxmlformats.org/officeDocument/2006/math" xmlns:v="urn:schemas-microsoft-com:vml" xmlns:wp14="http://schemas.microsoft.com/office/word/2010/wordprocessingDrawing" xmlns:wp="http://schemas.openxmlformats.org/drawingml/2006/wordprocessingDrawing" xmlns:w10="urn:schemas-microsoft-com:office:word" xmlns:w="http://schemas.openxmlformats.org/wordprocessingml/2006/main" xmlns:w14="http://schemas.microsoft.com/office/word/2010/wordml" xmlns:w15="http://schemas.microsoft.com/office/word/2012/wordml" xmlns:w16cex="http://schemas.microsoft.com/office/word/2018/wordml/cex" xmlns:w16cid="http://schemas.microsoft.com/office/word/2016/wordml/cid" xmlns:w16="http://schemas.microsoft.com/office/word/2018/wordml" xmlns:w16du="http://schemas.microsoft.com/office/word/2023/wordml/word16du" xmlns:w16sdtdh="http://schemas.microsoft.com/office/word/2020/wordml/sdtdatahash" xmlns:w16sdtfl="http://schemas.microsoft.com/office/word/2024/wordml/sdtformatlock" xmlns:w16se="http://schemas.microsoft.com/office/word/2015/wordml/symex" xmlns:wpg="http://schemas.microsoft.com/office/word/2010/wordprocessingGroup" xmlns:wpi="http://schemas.microsoft.com/office/word/2010/wordprocessingInk" xmlns:wne="http://schemas.microsoft.com/office/word/2006/wordml" xmlns:wps="http://schemas.microsoft.com/office/word/2010/wordprocessingShape" mc:Ignorable="w14 w15 w16se w16cid w16 w16cex w16sdtdh w16sdtfl w16du wp14">
+<w:document xmlns:wpc="http://schemas.microsoft.com/office/word/2010/wordprocessingCanvas" xmlns:cx="http://schemas.microsoft.com/office/drawing/2014/chartex" xmlns:cx1="http://schemas.microsoft.com/office/drawing/2015/9/8/chartex" xmlns:cx2="http://schemas.microsoft.com/office/drawing/2015/10/21/chartex" xmlns:cx3="http://schemas.microsoft.com/office/drawing/2016/5/9/chartex" xmlns:cx4="http://schemas.microsoft.com/office/drawing/2016/5/10/chartex" xmlns:cx5="http://schemas.microsoft.com/office/drawing/2016/5/11/chartex" xmlns:cx6="http://schemas.microsoft.com/office/drawing/2016/5/12/chartex" xmlns:cx7="http://schemas.microsoft.com/office/drawing/2016/5/13/chartex" xmlns:cx8="http://schemas.microsoft.com/office/drawing/2016/5/14/chartex" xmlns:mc="http://schemas.openxmlformats.org/markup-compatibility/2006" xmlns:aink="http://schemas.microsoft.com/office/drawing/2016/ink" xmlns:am3d="http://schemas.microsoft.com/office/drawing/2017/model3d" xmlns:o="urn:schemas-microsoft-com:office:office" xmlns:oel="http://schemas.microsoft.com/office/2019/extlst" xmlns:r="http://schemas.openxmlformats.org/officeDocument/2006/relationships" xmlns:m="http://schemas.openxmlformats.org/officeDocument/2006/math" xmlns:v="urn:schemas-microsoft-com:vml" xmlns:wp14="http://schemas.microsoft.com/office/word/2010/wordprocessingDrawing" xmlns:wp="http://schemas.openxmlformats.org/drawingml/2006/wordprocessingDrawing" xmlns:w10="urn:schemas-microsoft-com:office:word" xmlns:w="http://schemas.openxmlformats.org/wordprocessingml/2006/main" xmlns:w14="http://schemas.microsoft.com/office/word/2010/wordml" xmlns:w15="http://schemas.microsoft.com/office/word/2012/wordml" xmlns:w16cex="http://schemas.microsoft.com/office/word/2018/wordml/cex" xmlns:w16cid="http://schemas.microsoft.com/office/word/2016/wordml/cid" xmlns:w16="http://schemas.microsoft.com/office/word/2018/wordml" xmlns:w16sdtdh="http://schemas.microsoft.com/office/word/2020/wordml/sdtdatahash" xmlns:w16se="http://schemas.microsoft.com/office/word/2015/wordml/symex" xmlns:wpg="http://schemas.microsoft.com/office/word/2010/wordprocessingGroup" xmlns:wpi="http://schemas.microsoft.com/office/word/2010/wordprocessingInk" xmlns:wne="http://schemas.microsoft.com/office/word/2006/wordml" xmlns:wps="http://schemas.microsoft.com/office/word/2010/wordprocessingShape" mc:Ignorable="w14 w15 w16se w16cid w16 w16cex w16sdtdh wp14">
   <w:body>
     <w:p>
       <w:pPr>
+        <w:spacing w:after="140"/>
         <w:jc w:val="center"/>
         <w:rPr>
-          <w:rFonts w:ascii="標楷體" w:eastAsia="DengXian" w:hAnsi="標楷體" w:cstheme="majorHAnsi" w:hint="eastAsia"/>
+          <w:rFonts w:ascii="標楷體" w:eastAsia="標楷體" w:hAnsi="標楷體" w:cstheme="majorHAnsi"/>
           <w:lang w:eastAsia="zh-CN"/>
         </w:rPr>
       </w:pPr>
@@ -94,7 +95,9 @@
         <w:gridCol w:w="586"/>
         <w:gridCol w:w="548"/>
         <w:gridCol w:w="379"/>
-        <w:gridCol w:w="2456"/>
+        <w:gridCol w:w="755"/>
+        <w:gridCol w:w="1134"/>
+        <w:gridCol w:w="567"/>
         <w:gridCol w:w="746"/>
         <w:gridCol w:w="2373"/>
       </w:tblGrid>
@@ -109,6 +112,7 @@
           </w:tcPr>
           <w:p>
             <w:pPr>
+              <w:spacing w:after="140"/>
               <w:ind w:firstLineChars="200" w:firstLine="480"/>
               <w:jc w:val="center"/>
               <w:rPr>
@@ -132,6 +136,7 @@
           </w:tcPr>
           <w:p>
             <w:pPr>
+              <w:spacing w:after="140"/>
               <w:jc w:val="center"/>
               <w:rPr>
                 <w:rFonts w:ascii="標楷體" w:eastAsia="標楷體" w:hAnsi="標楷體" w:cstheme="majorHAnsi"/>
@@ -148,6 +153,7 @@
           </w:tcPr>
           <w:p>
             <w:pPr>
+              <w:spacing w:after="140"/>
               <w:jc w:val="center"/>
               <w:rPr>
                 <w:rFonts w:ascii="標楷體" w:eastAsia="標楷體" w:hAnsi="標楷體" w:cstheme="majorHAnsi"/>
@@ -166,11 +172,12 @@
         <w:tc>
           <w:tcPr>
             <w:tcW w:w="3581" w:type="dxa"/>
-            <w:gridSpan w:val="3"/>
-            <w:vAlign w:val="center"/>
-          </w:tcPr>
-          <w:p>
-            <w:pPr>
+            <w:gridSpan w:val="5"/>
+            <w:vAlign w:val="center"/>
+          </w:tcPr>
+          <w:p>
+            <w:pPr>
+              <w:spacing w:after="140"/>
               <w:ind w:firstLineChars="400" w:firstLine="960"/>
               <w:jc w:val="center"/>
               <w:rPr>
@@ -186,47 +193,9 @@
             </w:r>
             <w:r>
               <w:rPr>
-                <w:rFonts w:ascii="標楷體" w:eastAsia="標楷體" w:hAnsi="標楷體" w:hint="eastAsia"/>
-              </w:rPr>
-              <w:t>男</w:t>
-            </w:r>
-            <w:r>
-              <w:rPr>
                 <w:rFonts w:ascii="標楷體" w:eastAsia="標楷體" w:hAnsi="標楷體"/>
               </w:rPr>
-              <w:t xml:space="preserve"> </w:t>
-            </w:r>
-            <w:r>
-              <w:rPr>
-                <w:rFonts w:ascii="標楷體" w:eastAsia="標楷體" w:hAnsi="標楷體" w:hint="eastAsia"/>
-                <w:lang w:eastAsia="zh-CN"/>
-              </w:rPr>
-              <w:t xml:space="preserve">  </w:t>
-            </w:r>
-            <w:r>
-              <w:rPr>
-                <w:rFonts w:ascii="標楷體" w:eastAsia="標楷體" w:hAnsi="標楷體"/>
-              </w:rPr>
-              <w:t xml:space="preserve"> </w:t>
-            </w:r>
-            <w:r>
-              <w:rPr>
-                <w:rFonts w:ascii="標楷體" w:eastAsia="標楷體" w:hAnsi="標楷體" w:hint="eastAsia"/>
-                <w:lang w:eastAsia="zh-CN"/>
-              </w:rPr>
-              <w:t xml:space="preserve">   </w:t>
-            </w:r>
-            <w:r>
-              <w:rPr>
-                <w:rFonts w:ascii="標楷體" w:eastAsia="標楷體" w:hAnsi="標楷體"/>
-              </w:rPr>
-              <w:t>□</w:t>
-            </w:r>
-            <w:r>
-              <w:rPr>
-                <w:rFonts w:ascii="標楷體" w:eastAsia="標楷體" w:hAnsi="標楷體" w:hint="eastAsia"/>
-              </w:rPr>
-              <w:t>女</w:t>
+              <w:t>男   □女</w:t>
             </w:r>
           </w:p>
         </w:tc>
@@ -238,8 +207,10 @@
           </w:tcPr>
           <w:p>
             <w:pPr>
-              <w:rPr>
-                <w:rFonts w:eastAsia="標楷體" w:cstheme="majorHAnsi"/>
+              <w:spacing w:after="140"/>
+              <w:jc w:val="center"/>
+              <w:rPr>
+                <w:rFonts w:ascii="標楷體" w:eastAsia="標楷體" w:hAnsi="標楷體" w:cstheme="majorHAnsi"/>
                 <w:lang w:val="vi-VN" w:eastAsia="zh-CN"/>
               </w:rPr>
             </w:pPr>
@@ -257,6 +228,7 @@
           </w:tcPr>
           <w:p>
             <w:pPr>
+              <w:spacing w:after="140"/>
               <w:ind w:firstLineChars="100" w:firstLine="240"/>
               <w:jc w:val="center"/>
               <w:rPr>
@@ -280,6 +252,7 @@
           </w:tcPr>
           <w:p>
             <w:pPr>
+              <w:spacing w:after="140"/>
               <w:jc w:val="center"/>
               <w:rPr>
                 <w:rFonts w:ascii="標楷體" w:eastAsia="標楷體" w:hAnsi="標楷體" w:cstheme="majorHAnsi"/>
@@ -296,6 +269,7 @@
           </w:tcPr>
           <w:p>
             <w:pPr>
+              <w:spacing w:after="140"/>
               <w:jc w:val="center"/>
               <w:rPr>
                 <w:rFonts w:ascii="標楷體" w:eastAsia="標楷體" w:hAnsi="標楷體" w:cstheme="majorHAnsi"/>
@@ -312,13 +286,60 @@
         </w:tc>
         <w:tc>
           <w:tcPr>
-            <w:tcW w:w="3581" w:type="dxa"/>
-            <w:gridSpan w:val="3"/>
-            <w:vAlign w:val="center"/>
-          </w:tcPr>
-          <w:p>
-            <w:pPr>
-              <w:jc w:val="center"/>
+            <w:tcW w:w="1134" w:type="dxa"/>
+            <w:gridSpan w:val="2"/>
+            <w:vAlign w:val="center"/>
+          </w:tcPr>
+          <w:p>
+            <w:pPr>
+              <w:spacing w:after="140"/>
+              <w:ind w:firstLineChars="100" w:firstLine="240"/>
+              <w:rPr>
+                <w:rFonts w:ascii="標楷體" w:eastAsia="標楷體" w:hAnsi="標楷體" w:cstheme="majorHAnsi"/>
+                <w:lang w:eastAsia="zh-CN"/>
+              </w:rPr>
+            </w:pPr>
+          </w:p>
+        </w:tc>
+        <w:tc>
+          <w:tcPr>
+            <w:tcW w:w="1134" w:type="dxa"/>
+            <w:vAlign w:val="center"/>
+          </w:tcPr>
+          <w:p>
+            <w:pPr>
+              <w:spacing w:after="140"/>
+              <w:ind w:firstLineChars="100" w:firstLine="240"/>
+              <w:rPr>
+                <w:rFonts w:ascii="標楷體" w:eastAsia="標楷體" w:hAnsi="標楷體" w:cstheme="majorHAnsi"/>
+              </w:rPr>
+            </w:pPr>
+            <w:r>
+              <w:rPr>
+                <w:rFonts w:ascii="標楷體" w:eastAsia="標楷體" w:hAnsi="標楷體" w:cstheme="majorHAnsi" w:hint="eastAsia"/>
+                <w:lang w:eastAsia="zh-CN"/>
+              </w:rPr>
+              <w:t>國</w:t>
+            </w:r>
+            <w:r>
+              <w:rPr>
+                <w:rFonts w:ascii="標楷體" w:eastAsia="標楷體" w:hAnsi="標楷體" w:cstheme="majorHAnsi" w:hint="eastAsia"/>
+                <w:lang w:eastAsia="zh-CN"/>
+              </w:rPr>
+              <w:t>籍</w:t>
+            </w:r>
+          </w:p>
+        </w:tc>
+        <w:tc>
+          <w:tcPr>
+            <w:tcW w:w="1313" w:type="dxa"/>
+            <w:gridSpan w:val="2"/>
+            <w:vAlign w:val="center"/>
+          </w:tcPr>
+          <w:p>
+            <w:pPr>
+              <w:spacing w:after="140"/>
+              <w:ind w:firstLineChars="200" w:firstLine="480"/>
               <w:rPr>
                 <w:rFonts w:ascii="標楷體" w:eastAsia="標楷體" w:hAnsi="標楷體" w:cstheme="majorHAnsi"/>
                 <w:lang w:eastAsia="zh-CN"/>
@@ -334,6 +355,7 @@
           </w:tcPr>
           <w:p>
             <w:pPr>
+              <w:spacing w:after="140"/>
               <w:jc w:val="center"/>
               <w:rPr>
                 <w:rFonts w:ascii="標楷體" w:eastAsia="標楷體" w:hAnsi="標楷體" w:cstheme="majorHAnsi"/>
@@ -354,6 +376,7 @@
           </w:tcPr>
           <w:p>
             <w:pPr>
+              <w:spacing w:after="140"/>
               <w:ind w:firstLineChars="100" w:firstLine="240"/>
               <w:jc w:val="center"/>
               <w:rPr>
@@ -378,6 +401,7 @@
           </w:tcPr>
           <w:p>
             <w:pPr>
+              <w:spacing w:after="140"/>
               <w:jc w:val="center"/>
               <w:rPr>
                 <w:rFonts w:ascii="標楷體" w:eastAsia="標楷體" w:hAnsi="標楷體" w:cstheme="majorHAnsi"/>
@@ -394,7 +418,7 @@
               <w:rPr>
                 <w:rFonts w:ascii="標楷體" w:eastAsia="標楷體" w:hAnsi="標楷體"/>
               </w:rPr>
-              <w:t>未婚  □已婚</w:t>
+              <w:t>未婚   □已婚</w:t>
             </w:r>
           </w:p>
         </w:tc>
@@ -406,6 +430,7 @@
           </w:tcPr>
           <w:p>
             <w:pPr>
+              <w:spacing w:after="140"/>
               <w:jc w:val="center"/>
               <w:rPr>
                 <w:rFonts w:ascii="標楷體" w:eastAsia="標楷體" w:hAnsi="標楷體" w:cstheme="majorHAnsi"/>
@@ -423,11 +448,12 @@
         <w:tc>
           <w:tcPr>
             <w:tcW w:w="3581" w:type="dxa"/>
-            <w:gridSpan w:val="3"/>
-            <w:vAlign w:val="center"/>
-          </w:tcPr>
-          <w:p>
-            <w:pPr>
+            <w:gridSpan w:val="5"/>
+            <w:vAlign w:val="center"/>
+          </w:tcPr>
+          <w:p>
+            <w:pPr>
+              <w:spacing w:after="140"/>
               <w:jc w:val="center"/>
               <w:rPr>
                 <w:rFonts w:ascii="標楷體" w:eastAsia="標楷體" w:hAnsi="標楷體" w:cstheme="majorHAnsi"/>
@@ -444,6 +470,7 @@
           </w:tcPr>
           <w:p>
             <w:pPr>
+              <w:spacing w:after="140"/>
               <w:jc w:val="center"/>
               <w:rPr>
                 <w:rFonts w:ascii="標楷體" w:eastAsia="標楷體" w:hAnsi="標楷體" w:cstheme="majorHAnsi"/>
@@ -464,6 +491,7 @@
           </w:tcPr>
           <w:p>
             <w:pPr>
+              <w:spacing w:after="140"/>
               <w:ind w:firstLineChars="100" w:firstLine="240"/>
               <w:jc w:val="center"/>
               <w:rPr>
@@ -487,6 +515,7 @@
           </w:tcPr>
           <w:p>
             <w:pPr>
+              <w:spacing w:after="140"/>
               <w:jc w:val="center"/>
               <w:rPr>
                 <w:rFonts w:ascii="標楷體" w:eastAsia="標楷體" w:hAnsi="標楷體" w:cstheme="majorHAnsi"/>
@@ -503,6 +532,7 @@
           </w:tcPr>
           <w:p>
             <w:pPr>
+              <w:spacing w:after="140"/>
               <w:jc w:val="center"/>
               <w:rPr>
                 <w:rFonts w:ascii="標楷體" w:eastAsia="標楷體" w:hAnsi="標楷體" w:cstheme="majorHAnsi"/>
@@ -520,11 +550,12 @@
         <w:tc>
           <w:tcPr>
             <w:tcW w:w="3581" w:type="dxa"/>
-            <w:gridSpan w:val="3"/>
-            <w:vAlign w:val="center"/>
-          </w:tcPr>
-          <w:p>
-            <w:pPr>
+            <w:gridSpan w:val="5"/>
+            <w:vAlign w:val="center"/>
+          </w:tcPr>
+          <w:p>
+            <w:pPr>
+              <w:spacing w:after="140"/>
               <w:jc w:val="center"/>
               <w:rPr>
                 <w:rFonts w:ascii="標楷體" w:eastAsia="標楷體" w:hAnsi="標楷體" w:cstheme="majorHAnsi"/>
@@ -541,6 +572,7 @@
           </w:tcPr>
           <w:p>
             <w:pPr>
+              <w:spacing w:after="140"/>
               <w:jc w:val="center"/>
               <w:rPr>
                 <w:rFonts w:ascii="標楷體" w:eastAsia="標楷體" w:hAnsi="標楷體" w:cstheme="majorHAnsi"/>
@@ -561,6 +593,7 @@
           </w:tcPr>
           <w:p>
             <w:pPr>
+              <w:spacing w:after="140"/>
               <w:jc w:val="center"/>
               <w:rPr>
                 <w:rFonts w:ascii="標楷體" w:eastAsia="標楷體" w:hAnsi="標楷體" w:cstheme="majorHAnsi"/>
@@ -579,11 +612,12 @@
         <w:tc>
           <w:tcPr>
             <w:tcW w:w="6841" w:type="dxa"/>
-            <w:gridSpan w:val="7"/>
-            <w:vAlign w:val="center"/>
-          </w:tcPr>
-          <w:p>
-            <w:pPr>
+            <w:gridSpan w:val="9"/>
+            <w:vAlign w:val="center"/>
+          </w:tcPr>
+          <w:p>
+            <w:pPr>
+              <w:spacing w:after="140"/>
               <w:jc w:val="center"/>
               <w:rPr>
                 <w:rFonts w:ascii="標楷體" w:eastAsia="標楷體" w:hAnsi="標楷體" w:cstheme="majorHAnsi"/>
@@ -599,6 +633,7 @@
           </w:tcPr>
           <w:p>
             <w:pPr>
+              <w:spacing w:after="140"/>
               <w:jc w:val="center"/>
               <w:rPr>
                 <w:rFonts w:ascii="標楷體" w:eastAsia="標楷體" w:hAnsi="標楷體" w:cstheme="majorHAnsi"/>
@@ -622,6 +657,7 @@
           </w:tcPr>
           <w:p>
             <w:pPr>
+              <w:spacing w:after="140"/>
               <w:jc w:val="center"/>
               <w:rPr>
                 <w:rFonts w:ascii="標楷體" w:eastAsia="標楷體" w:hAnsi="標楷體" w:cstheme="majorHAnsi"/>
@@ -647,6 +683,7 @@
           </w:tcPr>
           <w:p>
             <w:pPr>
+              <w:spacing w:after="140"/>
               <w:jc w:val="center"/>
               <w:rPr>
                 <w:rFonts w:ascii="標楷體" w:eastAsia="標楷體" w:hAnsi="標楷體" w:cstheme="majorHAnsi"/>
@@ -678,11 +715,12 @@
         <w:tc>
           <w:tcPr>
             <w:tcW w:w="3581" w:type="dxa"/>
-            <w:gridSpan w:val="3"/>
-            <w:vAlign w:val="center"/>
-          </w:tcPr>
-          <w:p>
-            <w:pPr>
+            <w:gridSpan w:val="5"/>
+            <w:vAlign w:val="center"/>
+          </w:tcPr>
+          <w:p>
+            <w:pPr>
+              <w:spacing w:after="140"/>
               <w:jc w:val="center"/>
               <w:rPr>
                 <w:rFonts w:ascii="標楷體" w:eastAsia="標楷體" w:hAnsi="標楷體" w:cstheme="majorHAnsi"/>
@@ -709,6 +747,7 @@
           </w:tcPr>
           <w:p>
             <w:pPr>
+              <w:spacing w:after="140"/>
               <w:jc w:val="center"/>
               <w:rPr>
                 <w:rFonts w:ascii="標楷體" w:eastAsia="標楷體" w:hAnsi="標楷體" w:cstheme="majorHAnsi"/>
@@ -742,6 +781,7 @@
           </w:tcPr>
           <w:p>
             <w:pPr>
+              <w:spacing w:after="140"/>
               <w:jc w:val="center"/>
               <w:rPr>
                 <w:rFonts w:ascii="標楷體" w:eastAsia="標楷體" w:hAnsi="標楷體" w:cstheme="majorHAnsi"/>
@@ -757,6 +797,7 @@
           </w:tcPr>
           <w:p>
             <w:pPr>
+              <w:spacing w:after="140"/>
               <w:jc w:val="center"/>
               <w:rPr>
                 <w:rFonts w:ascii="標楷體" w:eastAsia="標楷體" w:hAnsi="標楷體" w:cstheme="majorHAnsi"/>
@@ -767,11 +808,12 @@
         <w:tc>
           <w:tcPr>
             <w:tcW w:w="3581" w:type="dxa"/>
-            <w:gridSpan w:val="3"/>
-            <w:vAlign w:val="center"/>
-          </w:tcPr>
-          <w:p>
-            <w:pPr>
+            <w:gridSpan w:val="5"/>
+            <w:vAlign w:val="center"/>
+          </w:tcPr>
+          <w:p>
+            <w:pPr>
+              <w:spacing w:after="140"/>
               <w:jc w:val="center"/>
               <w:rPr>
                 <w:rFonts w:ascii="標楷體" w:eastAsia="標楷體" w:hAnsi="標楷體" w:cstheme="majorHAnsi"/>
@@ -787,18 +829,33 @@
           </w:tcPr>
           <w:p>
             <w:pPr>
-              <w:jc w:val="center"/>
-              <w:rPr>
-                <w:rFonts w:ascii="標楷體" w:eastAsia="標楷體" w:hAnsi="標楷體" w:cstheme="majorHAnsi"/>
-                <w:lang w:eastAsia="zh-CN"/>
-              </w:rPr>
-            </w:pPr>
-            <w:r>
-              <w:rPr>
-                <w:rFonts w:ascii="標楷體" w:eastAsia="標楷體" w:hAnsi="標楷體" w:cstheme="majorHAnsi"/>
-                <w:lang w:eastAsia="zh-CN"/>
-              </w:rPr>
-              <w:t>年  月</w:t>
+              <w:spacing w:after="140"/>
+              <w:jc w:val="center"/>
+              <w:rPr>
+                <w:rFonts w:ascii="標楷體" w:eastAsia="標楷體" w:hAnsi="標楷體" w:cstheme="majorHAnsi"/>
+                <w:lang w:eastAsia="zh-CN"/>
+              </w:rPr>
+            </w:pPr>
+            <w:r>
+              <w:rPr>
+                <w:rFonts w:ascii="標楷體" w:eastAsia="標楷體" w:hAnsi="標楷體" w:cstheme="majorHAnsi"/>
+                <w:lang w:eastAsia="zh-CN"/>
+              </w:rPr>
+              <w:t>年</w:t>
+            </w:r>
+            <w:r>
+              <w:rPr>
+                <w:rFonts w:ascii="標楷體" w:eastAsia="DengXian" w:hAnsi="標楷體" w:cstheme="majorHAnsi" w:hint="eastAsia"/>
+                <w:lang w:eastAsia="zh-CN"/>
+              </w:rPr>
+              <w:t xml:space="preserve">   </w:t>
+            </w:r>
+            <w:r>
+              <w:rPr>
+                <w:rFonts w:ascii="標楷體" w:eastAsia="標楷體" w:hAnsi="標楷體" w:cstheme="majorHAnsi"/>
+                <w:lang w:eastAsia="zh-CN"/>
+              </w:rPr>
+              <w:t>月</w:t>
             </w:r>
           </w:p>
         </w:tc>
@@ -816,14 +873,16 @@
           </w:tcPr>
           <w:p>
             <w:pPr>
-              <w:jc w:val="center"/>
-              <w:rPr>
-                <w:rFonts w:ascii="標楷體" w:eastAsia="標楷體" w:hAnsi="標楷體" w:cstheme="majorHAnsi"/>
-              </w:rPr>
-            </w:pPr>
-          </w:p>
-          <w:p>
-            <w:pPr>
+              <w:spacing w:after="140"/>
+              <w:jc w:val="center"/>
+              <w:rPr>
+                <w:rFonts w:ascii="標楷體" w:eastAsia="標楷體" w:hAnsi="標楷體" w:cstheme="majorHAnsi"/>
+              </w:rPr>
+            </w:pPr>
+          </w:p>
+          <w:p>
+            <w:pPr>
+              <w:spacing w:after="140"/>
               <w:jc w:val="center"/>
               <w:rPr>
                 <w:rFonts w:ascii="標楷體" w:eastAsia="標楷體" w:hAnsi="標楷體" w:cstheme="majorHAnsi"/>
@@ -842,6 +901,7 @@
           </w:p>
           <w:p>
             <w:pPr>
+              <w:spacing w:after="140"/>
               <w:jc w:val="center"/>
               <w:rPr>
                 <w:rFonts w:ascii="標楷體" w:eastAsia="標楷體" w:hAnsi="標楷體" w:cstheme="majorHAnsi"/>
@@ -856,6 +916,7 @@
           </w:p>
           <w:p>
             <w:pPr>
+              <w:spacing w:after="140"/>
               <w:jc w:val="center"/>
               <w:rPr>
                 <w:rFonts w:ascii="標楷體" w:eastAsia="標楷體" w:hAnsi="標楷體" w:cstheme="majorHAnsi"/>
@@ -877,6 +938,7 @@
           </w:tcPr>
           <w:p>
             <w:pPr>
+              <w:spacing w:after="140"/>
               <w:jc w:val="center"/>
               <w:rPr>
                 <w:rFonts w:ascii="標楷體" w:eastAsia="標楷體" w:hAnsi="標楷體" w:cstheme="majorHAnsi"/>
@@ -897,11 +959,12 @@
         <w:tc>
           <w:tcPr>
             <w:tcW w:w="2835" w:type="dxa"/>
-            <w:gridSpan w:val="2"/>
-            <w:vAlign w:val="center"/>
-          </w:tcPr>
-          <w:p>
-            <w:pPr>
+            <w:gridSpan w:val="4"/>
+            <w:vAlign w:val="center"/>
+          </w:tcPr>
+          <w:p>
+            <w:pPr>
+              <w:spacing w:after="140"/>
               <w:jc w:val="center"/>
               <w:rPr>
                 <w:rFonts w:ascii="標楷體" w:eastAsia="標楷體" w:hAnsi="標楷體" w:cstheme="majorHAnsi"/>
@@ -928,6 +991,7 @@
           </w:tcPr>
           <w:p>
             <w:pPr>
+              <w:spacing w:after="140"/>
               <w:jc w:val="center"/>
               <w:rPr>
                 <w:rFonts w:ascii="標楷體" w:eastAsia="標楷體" w:hAnsi="標楷體" w:cstheme="majorHAnsi"/>
@@ -959,6 +1023,7 @@
           </w:tcPr>
           <w:p>
             <w:pPr>
+              <w:spacing w:after="140"/>
               <w:jc w:val="center"/>
               <w:rPr>
                 <w:rFonts w:ascii="標楷體" w:eastAsia="標楷體" w:hAnsi="標楷體" w:cstheme="majorHAnsi"/>
@@ -974,6 +1039,7 @@
           </w:tcPr>
           <w:p>
             <w:pPr>
+              <w:spacing w:after="140"/>
               <w:jc w:val="center"/>
               <w:rPr>
                 <w:rFonts w:ascii="標楷體" w:eastAsia="標楷體" w:hAnsi="標楷體" w:cstheme="majorHAnsi"/>
@@ -984,16 +1050,23 @@
         <w:tc>
           <w:tcPr>
             <w:tcW w:w="2835" w:type="dxa"/>
-            <w:gridSpan w:val="2"/>
-            <w:vAlign w:val="center"/>
-          </w:tcPr>
-          <w:p>
-            <w:pPr>
-              <w:jc w:val="center"/>
-              <w:rPr>
-                <w:rFonts w:ascii="標楷體" w:eastAsia="標楷體" w:hAnsi="標楷體" w:cstheme="majorHAnsi"/>
-              </w:rPr>
-            </w:pPr>
+            <w:gridSpan w:val="4"/>
+            <w:vAlign w:val="center"/>
+          </w:tcPr>
+          <w:p>
+            <w:pPr>
+              <w:spacing w:after="140"/>
+              <w:jc w:val="center"/>
+              <w:rPr>
+                <w:rFonts w:ascii="標楷體" w:eastAsia="標楷體" w:hAnsi="標楷體" w:cstheme="majorHAnsi"/>
+              </w:rPr>
+            </w:pPr>
+            <w:r>
+              <w:rPr>
+                <w:rFonts w:ascii="標楷體" w:eastAsia="標楷體" w:hAnsi="標楷體"/>
+              </w:rPr>
+              <w:t>e</w:t>
+            </w:r>
           </w:p>
         </w:tc>
         <w:tc>
@@ -1004,6 +1077,7 @@
           </w:tcPr>
           <w:p>
             <w:pPr>
+              <w:spacing w:after="140"/>
               <w:jc w:val="center"/>
               <w:rPr>
                 <w:rFonts w:ascii="標楷體" w:eastAsia="標楷體" w:hAnsi="標楷體" w:cstheme="majorHAnsi"/>
@@ -1026,6 +1100,7 @@
           </w:tcPr>
           <w:p>
             <w:pPr>
+              <w:spacing w:after="140"/>
               <w:jc w:val="center"/>
               <w:rPr>
                 <w:rFonts w:ascii="標楷體" w:eastAsia="標楷體" w:hAnsi="標楷體" w:cstheme="majorHAnsi"/>
@@ -1041,6 +1116,7 @@
           </w:tcPr>
           <w:p>
             <w:pPr>
+              <w:spacing w:after="140"/>
               <w:jc w:val="center"/>
               <w:rPr>
                 <w:rFonts w:ascii="標楷體" w:eastAsia="標楷體" w:hAnsi="標楷體" w:cstheme="majorHAnsi"/>
@@ -1051,11 +1127,12 @@
         <w:tc>
           <w:tcPr>
             <w:tcW w:w="2835" w:type="dxa"/>
-            <w:gridSpan w:val="2"/>
-            <w:vAlign w:val="center"/>
-          </w:tcPr>
-          <w:p>
-            <w:pPr>
+            <w:gridSpan w:val="4"/>
+            <w:vAlign w:val="center"/>
+          </w:tcPr>
+          <w:p>
+            <w:pPr>
+              <w:spacing w:after="140"/>
               <w:jc w:val="center"/>
               <w:rPr>
                 <w:rFonts w:ascii="標楷體" w:eastAsia="標楷體" w:hAnsi="標楷體" w:cstheme="majorHAnsi"/>
@@ -1071,6 +1148,7 @@
           </w:tcPr>
           <w:p>
             <w:pPr>
+              <w:spacing w:after="140"/>
               <w:jc w:val="center"/>
               <w:rPr>
                 <w:rFonts w:ascii="標楷體" w:eastAsia="標楷體" w:hAnsi="標楷體"/>
@@ -1093,6 +1171,7 @@
           </w:tcPr>
           <w:p>
             <w:pPr>
+              <w:spacing w:after="140"/>
               <w:jc w:val="center"/>
               <w:rPr>
                 <w:rFonts w:ascii="標楷體" w:eastAsia="標楷體" w:hAnsi="標楷體" w:cstheme="majorHAnsi"/>
@@ -1108,6 +1187,7 @@
           </w:tcPr>
           <w:p>
             <w:pPr>
+              <w:spacing w:after="140"/>
               <w:jc w:val="center"/>
               <w:rPr>
                 <w:rFonts w:ascii="標楷體" w:eastAsia="標楷體" w:hAnsi="標楷體" w:cstheme="majorHAnsi"/>
@@ -1118,16 +1198,17 @@
         <w:tc>
           <w:tcPr>
             <w:tcW w:w="2835" w:type="dxa"/>
-            <w:gridSpan w:val="2"/>
-            <w:vAlign w:val="center"/>
-          </w:tcPr>
-          <w:p>
-            <w:pPr>
+            <w:gridSpan w:val="4"/>
+            <w:vAlign w:val="center"/>
+          </w:tcPr>
+          <w:p>
+            <w:pPr>
+              <w:spacing w:after="140"/>
               <w:ind w:firstLineChars="400" w:firstLine="960"/>
               <w:jc w:val="center"/>
               <w:rPr>
-                <w:rFonts w:ascii="標楷體" w:eastAsia="標楷體" w:hAnsi="標楷體" w:cstheme="majorHAnsi"/>
-                <w:lang w:eastAsia="zh-CN"/>
+                <w:rFonts w:eastAsia="標楷體" w:cstheme="majorHAnsi"/>
+                <w:lang w:val="vi-VN" w:eastAsia="zh-CN"/>
               </w:rPr>
             </w:pPr>
           </w:p>
@@ -1140,6 +1221,7 @@
           </w:tcPr>
           <w:p>
             <w:pPr>
+              <w:spacing w:after="140"/>
               <w:ind w:firstLineChars="100" w:firstLine="240"/>
               <w:rPr>
                 <w:rFonts w:ascii="標楷體" w:eastAsia="標楷體" w:hAnsi="標楷體" w:cstheme="majorHAnsi"/>
@@ -1161,6 +1243,7 @@
           </w:tcPr>
           <w:p>
             <w:pPr>
+              <w:spacing w:after="140"/>
               <w:jc w:val="center"/>
               <w:rPr>
                 <w:rFonts w:ascii="標楷體" w:eastAsia="標楷體" w:hAnsi="標楷體" w:cstheme="majorHAnsi"/>
@@ -1176,6 +1259,7 @@
           </w:tcPr>
           <w:p>
             <w:pPr>
+              <w:spacing w:after="140"/>
               <w:jc w:val="center"/>
               <w:rPr>
                 <w:rFonts w:ascii="標楷體" w:eastAsia="標楷體" w:hAnsi="標楷體" w:cstheme="majorHAnsi"/>
@@ -1186,11 +1270,12 @@
         <w:tc>
           <w:tcPr>
             <w:tcW w:w="2835" w:type="dxa"/>
-            <w:gridSpan w:val="2"/>
-            <w:vAlign w:val="center"/>
-          </w:tcPr>
-          <w:p>
-            <w:pPr>
+            <w:gridSpan w:val="4"/>
+            <w:vAlign w:val="center"/>
+          </w:tcPr>
+          <w:p>
+            <w:pPr>
+              <w:spacing w:after="140"/>
               <w:jc w:val="center"/>
               <w:rPr>
                 <w:rFonts w:ascii="標楷體" w:eastAsia="標楷體" w:hAnsi="標楷體" w:cstheme="majorHAnsi"/>
@@ -1206,6 +1291,7 @@
           </w:tcPr>
           <w:p>
             <w:pPr>
+              <w:spacing w:after="140"/>
               <w:jc w:val="center"/>
               <w:rPr>
                 <w:rFonts w:ascii="標楷體" w:eastAsia="標楷體" w:hAnsi="標楷體" w:cstheme="majorHAnsi"/>
@@ -1226,6 +1312,7 @@
           </w:tcPr>
           <w:p>
             <w:pPr>
+              <w:spacing w:after="140"/>
               <w:ind w:firstLineChars="100" w:firstLine="240"/>
               <w:jc w:val="center"/>
               <w:rPr>
@@ -1249,15 +1336,16 @@
         <w:tc>
           <w:tcPr>
             <w:tcW w:w="8647" w:type="dxa"/>
-            <w:gridSpan w:val="7"/>
-            <w:vAlign w:val="center"/>
-          </w:tcPr>
-          <w:p>
-            <w:pPr>
+            <w:gridSpan w:val="9"/>
+            <w:vAlign w:val="center"/>
+          </w:tcPr>
+          <w:p>
+            <w:pPr>
+              <w:spacing w:after="140"/>
               <w:ind w:firstLineChars="100" w:firstLine="240"/>
               <w:jc w:val="center"/>
               <w:rPr>
-                <w:rFonts w:eastAsia="標楷體" w:cstheme="majorHAnsi"/>
+                <w:rFonts w:ascii="標楷體" w:eastAsia="標楷體" w:hAnsi="標楷體" w:cstheme="majorHAnsi"/>
                 <w:lang w:val="vi-VN" w:eastAsia="zh-CN"/>
               </w:rPr>
             </w:pPr>
@@ -1271,15 +1359,9 @@
             <w:r>
               <w:rPr>
                 <w:rFonts w:ascii="標楷體" w:eastAsia="標楷體" w:hAnsi="標楷體" w:cstheme="majorHAnsi"/>
-              </w:rPr>
-              <w:t>中文</w:t>
-            </w:r>
-            <w:r>
-              <w:rPr>
-                <w:rFonts w:ascii="標楷體" w:eastAsia="標楷體" w:hAnsi="標楷體" w:cstheme="majorHAnsi"/>
-                <w:lang w:eastAsia="zh-CN"/>
-              </w:rPr>
-              <w:t xml:space="preserve">     □ 英文     </w:t>
+                <w:lang w:eastAsia="zh-CN"/>
+              </w:rPr>
+              <w:t xml:space="preserve">中文   </w:t>
             </w:r>
             <w:r>
               <w:rPr>
@@ -1293,7 +1375,7 @@
                 <w:rFonts w:ascii="標楷體" w:eastAsia="標楷體" w:hAnsi="標楷體" w:cstheme="majorHAnsi"/>
                 <w:lang w:eastAsia="zh-CN"/>
               </w:rPr>
-              <w:t>越文   □  其他</w:t>
+              <w:t>英文   □越文   □其他</w:t>
             </w:r>
           </w:p>
         </w:tc>
@@ -1310,6 +1392,7 @@
           </w:tcPr>
           <w:p>
             <w:pPr>
+              <w:spacing w:after="140"/>
               <w:ind w:firstLineChars="300" w:firstLine="721"/>
               <w:jc w:val="center"/>
               <w:rPr>
@@ -1338,67 +1421,60 @@
           </w:tcPr>
           <w:p>
             <w:pPr>
+              <w:spacing w:after="140"/>
               <w:jc w:val="center"/>
               <w:rPr>
                 <w:rFonts w:ascii="標楷體" w:eastAsia="標楷體" w:hAnsi="標楷體" w:cstheme="majorHAnsi"/>
                 <w:lang w:val="vi-VN"/>
               </w:rPr>
             </w:pPr>
-            <w:proofErr w:type="gramStart"/>
+          </w:p>
+        </w:tc>
+        <w:tc>
+          <w:tcPr>
+            <w:tcW w:w="927" w:type="dxa"/>
+            <w:gridSpan w:val="2"/>
+            <w:vAlign w:val="center"/>
+          </w:tcPr>
+          <w:p>
+            <w:pPr>
+              <w:spacing w:after="140"/>
+              <w:ind w:firstLineChars="100" w:firstLine="240"/>
+              <w:rPr>
+                <w:rFonts w:ascii="標楷體" w:eastAsia="標楷體" w:hAnsi="標楷體" w:cstheme="majorHAnsi"/>
+                <w:lang w:val="vi-VN" w:eastAsia="zh-CN"/>
+              </w:rPr>
+            </w:pPr>
             <w:r>
               <w:rPr>
                 <w:rFonts w:ascii="標楷體" w:eastAsia="標楷體" w:hAnsi="標楷體" w:cstheme="majorHAnsi" w:hint="eastAsia"/>
                 <w:lang w:val="vi-VN"/>
               </w:rPr>
-              <w:t>中文華測</w:t>
-            </w:r>
-            <w:proofErr w:type="gramEnd"/>
-            <w:r>
-              <w:rPr>
-                <w:rFonts w:ascii="標楷體" w:eastAsia="標楷體" w:hAnsi="標楷體" w:cstheme="majorHAnsi" w:hint="eastAsia"/>
+              <w:t>交通</w:t>
+            </w:r>
+          </w:p>
+        </w:tc>
+        <w:tc>
+          <w:tcPr>
+            <w:tcW w:w="5575" w:type="dxa"/>
+            <w:gridSpan w:val="5"/>
+            <w:vAlign w:val="center"/>
+          </w:tcPr>
+          <w:p>
+            <w:pPr>
+              <w:spacing w:after="140"/>
+              <w:ind w:firstLineChars="100" w:firstLine="240"/>
+              <w:rPr>
+                <w:rFonts w:ascii="標楷體" w:eastAsia="標楷體" w:hAnsi="標楷體" w:cstheme="majorHAnsi"/>
                 <w:lang w:val="vi-VN"/>
               </w:rPr>
-              <w:t xml:space="preserve"> B1</w:t>
-            </w:r>
-          </w:p>
-        </w:tc>
-        <w:tc>
-          <w:tcPr>
-            <w:tcW w:w="927" w:type="dxa"/>
-            <w:gridSpan w:val="2"/>
-            <w:vAlign w:val="center"/>
-          </w:tcPr>
-          <w:p>
-            <w:pPr>
-              <w:ind w:firstLineChars="100" w:firstLine="240"/>
-              <w:rPr>
-                <w:rFonts w:ascii="標楷體" w:eastAsia="標楷體" w:hAnsi="標楷體" w:cstheme="majorHAnsi"/>
-                <w:lang w:val="vi-VN" w:eastAsia="zh-CN"/>
-              </w:rPr>
-            </w:pPr>
-            <w:r>
-              <w:rPr>
-                <w:rFonts w:ascii="標楷體" w:eastAsia="標楷體" w:hAnsi="標楷體" w:cstheme="majorHAnsi" w:hint="eastAsia"/>
-                <w:lang w:val="vi-VN"/>
-              </w:rPr>
-              <w:t>交通</w:t>
-            </w:r>
-          </w:p>
-        </w:tc>
-        <w:tc>
-          <w:tcPr>
-            <w:tcW w:w="5575" w:type="dxa"/>
-            <w:gridSpan w:val="3"/>
-            <w:vAlign w:val="center"/>
-          </w:tcPr>
-          <w:p>
-            <w:pPr>
-              <w:ind w:firstLineChars="100" w:firstLine="240"/>
-              <w:rPr>
-                <w:rFonts w:ascii="標楷體" w:eastAsia="標楷體" w:hAnsi="標楷體" w:cstheme="majorHAnsi"/>
-                <w:lang w:val="vi-VN"/>
-              </w:rPr>
-            </w:pPr>
+            </w:pPr>
+            <w:r>
+              <w:rPr>
+                <w:rFonts w:ascii="標楷體" w:eastAsia="標楷體" w:hAnsi="標楷體" w:cstheme="majorHAnsi"/>
+              </w:rPr>
+              <w:t xml:space="preserve">□捷運   □汽車   </w:t>
+            </w:r>
             <w:r>
               <w:rPr>
                 <w:rFonts w:ascii="標楷體" w:eastAsia="標楷體" w:hAnsi="標楷體" w:cstheme="majorHAnsi"/>
@@ -1407,15 +1483,9 @@
             </w:r>
             <w:r>
               <w:rPr>
-                <w:rFonts w:ascii="標楷體" w:eastAsia="標楷體" w:hAnsi="標楷體" w:cstheme="majorHAnsi" w:hint="eastAsia"/>
-              </w:rPr>
-              <w:t xml:space="preserve">捷運 </w:t>
-            </w:r>
-            <w:r>
-              <w:rPr>
-                <w:rFonts w:ascii="標楷體" w:eastAsia="標楷體" w:hAnsi="標楷體" w:cstheme="majorHAnsi" w:hint="eastAsia"/>
-              </w:rPr>
-              <w:t xml:space="preserve"> </w:t>
+                <w:rFonts w:ascii="標楷體" w:eastAsia="標楷體" w:hAnsi="標楷體" w:cstheme="majorHAnsi"/>
+              </w:rPr>
+              <w:t xml:space="preserve">機車   </w:t>
             </w:r>
             <w:r>
               <w:rPr>
@@ -1425,57 +1495,9 @@
             </w:r>
             <w:r>
               <w:rPr>
-                <w:rFonts w:ascii="標楷體" w:eastAsia="標楷體" w:hAnsi="標楷體" w:cstheme="majorHAnsi" w:hint="eastAsia"/>
-              </w:rPr>
-              <w:t xml:space="preserve"> 汽車 </w:t>
-            </w:r>
-            <w:r>
-              <w:rPr>
-                <w:rFonts w:ascii="標楷體" w:eastAsia="標楷體" w:hAnsi="標楷體" w:cstheme="majorHAnsi" w:hint="eastAsia"/>
-              </w:rPr>
-              <w:t xml:space="preserve"> </w:t>
-            </w:r>
-            <w:r>
-              <w:rPr>
-                <w:rFonts w:ascii="標楷體" w:eastAsia="標楷體" w:hAnsi="標楷體" w:cstheme="majorHAnsi"/>
-              </w:rPr>
-              <w:t>□</w:t>
-            </w:r>
-            <w:r>
-              <w:rPr>
-                <w:rFonts w:ascii="標楷體" w:eastAsia="標楷體" w:hAnsi="標楷體" w:cstheme="majorHAnsi" w:hint="eastAsia"/>
-              </w:rPr>
-              <w:t xml:space="preserve">機車 </w:t>
-            </w:r>
-            <w:r>
-              <w:rPr>
-                <w:rFonts w:ascii="標楷體" w:eastAsia="標楷體" w:hAnsi="標楷體" w:cstheme="majorHAnsi"/>
-              </w:rPr>
-              <w:t>□</w:t>
-            </w:r>
-            <w:r>
-              <w:rPr>
-                <w:rFonts w:ascii="標楷體" w:eastAsia="標楷體" w:hAnsi="標楷體" w:cstheme="majorHAnsi" w:hint="eastAsia"/>
-              </w:rPr>
-              <w:t>公車</w:t>
-            </w:r>
-            <w:r>
-              <w:rPr>
-                <w:rFonts w:ascii="標楷體" w:eastAsia="標楷體" w:hAnsi="標楷體" w:cstheme="majorHAnsi" w:hint="eastAsia"/>
-              </w:rPr>
-              <w:t xml:space="preserve"> </w:t>
-            </w:r>
-            <w:r>
-              <w:rPr>
-                <w:rFonts w:ascii="標楷體" w:eastAsia="標楷體" w:hAnsi="標楷體" w:cstheme="majorHAnsi"/>
-              </w:rPr>
-              <w:t>□</w:t>
-            </w:r>
-            <w:r>
-              <w:rPr>
-                <w:rFonts w:ascii="標楷體" w:eastAsia="標楷體" w:hAnsi="標楷體" w:cstheme="majorHAnsi" w:hint="eastAsia"/>
-              </w:rPr>
-              <w:t>其他</w:t>
+                <w:rFonts w:ascii="標楷體" w:eastAsia="標楷體" w:hAnsi="標楷體" w:cstheme="majorHAnsi"/>
+              </w:rPr>
+              <w:t>公車   □其他</w:t>
             </w:r>
           </w:p>
         </w:tc>
@@ -1492,6 +1514,7 @@
           </w:tcPr>
           <w:p>
             <w:pPr>
+              <w:spacing w:after="140"/>
               <w:jc w:val="center"/>
               <w:rPr>
                 <w:rFonts w:ascii="標楷體" w:eastAsia="標楷體" w:hAnsi="標楷體" w:cstheme="majorHAnsi"/>
@@ -1510,6 +1533,7 @@
           </w:p>
           <w:p>
             <w:pPr>
+              <w:spacing w:after="140"/>
               <w:jc w:val="center"/>
               <w:rPr>
                 <w:rFonts w:ascii="標楷體" w:eastAsia="標楷體" w:hAnsi="標楷體" w:cstheme="majorHAnsi"/>
@@ -1530,11 +1554,12 @@
         <w:tc>
           <w:tcPr>
             <w:tcW w:w="8647" w:type="dxa"/>
-            <w:gridSpan w:val="7"/>
-            <w:vAlign w:val="center"/>
-          </w:tcPr>
-          <w:p>
-            <w:pPr>
+            <w:gridSpan w:val="9"/>
+            <w:vAlign w:val="center"/>
+          </w:tcPr>
+          <w:p>
+            <w:pPr>
+              <w:spacing w:after="140"/>
               <w:ind w:firstLineChars="100" w:firstLine="240"/>
               <w:rPr>
                 <w:rFonts w:ascii="標楷體" w:eastAsia="標楷體" w:hAnsi="標楷體" w:cstheme="majorHAnsi"/>
@@ -1548,7 +1573,7 @@
             </w:r>
             <w:r>
               <w:rPr>
-                <w:rFonts w:ascii="標楷體" w:eastAsia="標楷體" w:hAnsi="標楷體" w:cstheme="majorHAnsi" w:hint="eastAsia"/>
+                <w:rFonts w:ascii="標楷體" w:eastAsia="標楷體" w:hAnsi="標楷體" w:cstheme="majorHAnsi"/>
               </w:rPr>
               <w:t xml:space="preserve">台北   </w:t>
             </w:r>
@@ -1560,9 +1585,9 @@
             </w:r>
             <w:r>
               <w:rPr>
-                <w:rFonts w:ascii="標楷體" w:eastAsia="標楷體" w:hAnsi="標楷體" w:cstheme="majorHAnsi" w:hint="eastAsia"/>
-              </w:rPr>
-              <w:t xml:space="preserve">新北  </w:t>
+                <w:rFonts w:ascii="標楷體" w:eastAsia="標楷體" w:hAnsi="標楷體" w:cstheme="majorHAnsi"/>
+              </w:rPr>
+              <w:t xml:space="preserve">新北   □宜蘭   </w:t>
             </w:r>
             <w:r>
               <w:rPr>
@@ -1572,21 +1597,9 @@
             </w:r>
             <w:r>
               <w:rPr>
-                <w:rFonts w:ascii="標楷體" w:eastAsia="標楷體" w:hAnsi="標楷體" w:cstheme="majorHAnsi" w:hint="eastAsia"/>
-              </w:rPr>
-              <w:t>宜蘭</w:t>
-            </w:r>
-            <w:r>
-              <w:rPr>
-                <w:rFonts w:ascii="標楷體" w:eastAsia="標楷體" w:hAnsi="標楷體" w:cstheme="majorHAnsi" w:hint="eastAsia"/>
-              </w:rPr>
-              <w:t xml:space="preserve"> </w:t>
-            </w:r>
-            <w:r>
-              <w:rPr>
-                <w:rFonts w:ascii="標楷體" w:eastAsia="標楷體" w:hAnsi="標楷體" w:cstheme="majorHAnsi" w:hint="eastAsia"/>
-              </w:rPr>
-              <w:t xml:space="preserve"> </w:t>
+                <w:rFonts w:ascii="標楷體" w:eastAsia="標楷體" w:hAnsi="標楷體" w:cstheme="majorHAnsi"/>
+              </w:rPr>
+              <w:t xml:space="preserve">桃園   □新竹   □台中   □高雄   </w:t>
             </w:r>
             <w:r>
               <w:rPr>
@@ -1596,55 +1609,7 @@
             </w:r>
             <w:r>
               <w:rPr>
-                <w:rFonts w:ascii="標楷體" w:eastAsia="標楷體" w:hAnsi="標楷體" w:cstheme="majorHAnsi" w:hint="eastAsia"/>
-              </w:rPr>
-              <w:t xml:space="preserve">桃園   </w:t>
-            </w:r>
-            <w:r>
-              <w:rPr>
-                <w:rFonts w:ascii="標楷體" w:eastAsia="標楷體" w:hAnsi="標楷體" w:cstheme="majorHAnsi"/>
-              </w:rPr>
-              <w:t>□</w:t>
-            </w:r>
-            <w:r>
-              <w:rPr>
-                <w:rFonts w:ascii="標楷體" w:eastAsia="標楷體" w:hAnsi="標楷體" w:cstheme="majorHAnsi" w:hint="eastAsia"/>
-              </w:rPr>
-              <w:t xml:space="preserve">新竹   </w:t>
-            </w:r>
-            <w:r>
-              <w:rPr>
-                <w:rFonts w:ascii="標楷體" w:eastAsia="標楷體" w:hAnsi="標楷體" w:cstheme="majorHAnsi"/>
-              </w:rPr>
-              <w:t>□</w:t>
-            </w:r>
-            <w:r>
-              <w:rPr>
-                <w:rFonts w:ascii="標楷體" w:eastAsia="標楷體" w:hAnsi="標楷體" w:cstheme="majorHAnsi" w:hint="eastAsia"/>
-              </w:rPr>
-              <w:t xml:space="preserve">台中   </w:t>
-            </w:r>
-            <w:r>
-              <w:rPr>
-                <w:rFonts w:ascii="標楷體" w:eastAsia="標楷體" w:hAnsi="標楷體" w:cstheme="majorHAnsi"/>
-              </w:rPr>
-              <w:t>□</w:t>
-            </w:r>
-            <w:r>
-              <w:rPr>
-                <w:rFonts w:ascii="標楷體" w:eastAsia="標楷體" w:hAnsi="標楷體" w:cstheme="majorHAnsi" w:hint="eastAsia"/>
-              </w:rPr>
-              <w:t xml:space="preserve"> 高雄   </w:t>
-            </w:r>
-            <w:r>
-              <w:rPr>
-                <w:rFonts w:ascii="標楷體" w:eastAsia="標楷體" w:hAnsi="標楷體" w:cstheme="majorHAnsi"/>
-              </w:rPr>
-              <w:t>□</w:t>
-            </w:r>
-            <w:r>
-              <w:rPr>
-                <w:rFonts w:ascii="標楷體" w:eastAsia="標楷體" w:hAnsi="標楷體" w:cstheme="majorHAnsi" w:hint="eastAsia"/>
+                <w:rFonts w:ascii="標楷體" w:eastAsia="標楷體" w:hAnsi="標楷體" w:cstheme="majorHAnsi"/>
               </w:rPr>
               <w:t>台南</w:t>
             </w:r>
@@ -1663,6 +1628,7 @@
           </w:tcPr>
           <w:p>
             <w:pPr>
+              <w:spacing w:after="140"/>
               <w:jc w:val="center"/>
               <w:rPr>
                 <w:rFonts w:ascii="標楷體" w:eastAsia="標楷體" w:hAnsi="標楷體" w:cstheme="majorHAnsi"/>
@@ -1681,6 +1647,7 @@
           </w:p>
           <w:p>
             <w:pPr>
+              <w:spacing w:after="140"/>
               <w:jc w:val="center"/>
               <w:rPr>
                 <w:rFonts w:ascii="標楷體" w:eastAsia="標楷體" w:hAnsi="標楷體" w:cstheme="majorHAnsi"/>
@@ -1709,11 +1676,12 @@
         <w:tc>
           <w:tcPr>
             <w:tcW w:w="8647" w:type="dxa"/>
-            <w:gridSpan w:val="7"/>
-            <w:vAlign w:val="center"/>
-          </w:tcPr>
-          <w:p>
-            <w:pPr>
+            <w:gridSpan w:val="9"/>
+            <w:vAlign w:val="center"/>
+          </w:tcPr>
+          <w:p>
+            <w:pPr>
+              <w:spacing w:after="140"/>
               <w:ind w:leftChars="100" w:left="240"/>
               <w:rPr>
                 <w:rFonts w:ascii="標楷體" w:eastAsia="標楷體" w:hAnsi="標楷體" w:cstheme="majorHAnsi"/>
@@ -1724,25 +1692,33 @@
               <w:rPr>
                 <w:rFonts w:ascii="標楷體" w:eastAsia="標楷體" w:hAnsi="標楷體" w:cstheme="majorHAnsi"/>
               </w:rPr>
+              <w:t>□服務業（櫃檯/銷售人員） □餐飲業（外場/內場） □旅宿業（櫃檯/房</w:t>
+            </w:r>
+            <w:proofErr w:type="gramStart"/>
+            <w:r>
+              <w:rPr>
+                <w:rFonts w:ascii="標楷體" w:eastAsia="標楷體" w:hAnsi="標楷體" w:cstheme="majorHAnsi"/>
+              </w:rPr>
+              <w:t>務</w:t>
+            </w:r>
+            <w:proofErr w:type="gramEnd"/>
+            <w:r>
+              <w:rPr>
+                <w:rFonts w:ascii="標楷體" w:eastAsia="標楷體" w:hAnsi="標楷體" w:cstheme="majorHAnsi"/>
+              </w:rPr>
+              <w:t xml:space="preserve">）   </w:t>
+            </w:r>
+            <w:r>
+              <w:rPr>
+                <w:rFonts w:ascii="標楷體" w:eastAsia="標楷體" w:hAnsi="標楷體" w:cstheme="majorHAnsi"/>
+              </w:rPr>
               <w:t>□</w:t>
             </w:r>
             <w:r>
               <w:rPr>
-                <w:rFonts w:ascii="標楷體" w:eastAsia="標楷體" w:hAnsi="標楷體" w:cstheme="majorHAnsi" w:hint="eastAsia"/>
-              </w:rPr>
-              <w:t>服務業（櫃檯</w:t>
-            </w:r>
-            <w:r>
-              <w:rPr>
-                <w:rFonts w:ascii="標楷體" w:eastAsia="標楷體" w:hAnsi="標楷體" w:cstheme="majorHAnsi" w:hint="eastAsia"/>
-              </w:rPr>
-              <w:t>/</w:t>
-            </w:r>
-            <w:r>
-              <w:rPr>
-                <w:rFonts w:ascii="標楷體" w:eastAsia="標楷體" w:hAnsi="標楷體" w:cstheme="majorHAnsi" w:hint="eastAsia"/>
-              </w:rPr>
-              <w:t>銷售人員 ）</w:t>
+                <w:rFonts w:ascii="標楷體" w:eastAsia="標楷體" w:hAnsi="標楷體" w:cstheme="majorHAnsi"/>
+              </w:rPr>
+              <w:t xml:space="preserve">製造業   □內勤 (行政/行銷)   </w:t>
             </w:r>
             <w:r>
               <w:rPr>
@@ -1752,89 +1728,9 @@
             </w:r>
             <w:r>
               <w:rPr>
-                <w:rFonts w:ascii="標楷體" w:eastAsia="標楷體" w:hAnsi="標楷體" w:cstheme="majorHAnsi" w:hint="eastAsia"/>
-              </w:rPr>
-              <w:t>餐飲業</w:t>
-            </w:r>
-            <w:r>
-              <w:rPr>
-                <w:rFonts w:ascii="標楷體" w:eastAsia="標楷體" w:hAnsi="標楷體" w:cstheme="majorHAnsi" w:hint="eastAsia"/>
-              </w:rPr>
-              <w:t>（外場/內場）</w:t>
-            </w:r>
-            <w:r>
-              <w:rPr>
-                <w:rFonts w:ascii="標楷體" w:eastAsia="標楷體" w:hAnsi="標楷體" w:cstheme="majorHAnsi"/>
-                <w:lang w:val="vi-VN"/>
-              </w:rPr>
-              <w:t xml:space="preserve"> </w:t>
-            </w:r>
-            <w:r>
-              <w:rPr>
-                <w:rFonts w:ascii="標楷體" w:eastAsia="標楷體" w:hAnsi="標楷體" w:cstheme="majorHAnsi"/>
-              </w:rPr>
-              <w:t>□</w:t>
-            </w:r>
-            <w:r>
-              <w:rPr>
-                <w:rFonts w:ascii="標楷體" w:eastAsia="標楷體" w:hAnsi="標楷體" w:cstheme="majorHAnsi" w:hint="eastAsia"/>
-              </w:rPr>
-              <w:t>旅宿業</w:t>
-            </w:r>
-            <w:r>
-              <w:rPr>
-                <w:rFonts w:ascii="標楷體" w:eastAsia="標楷體" w:hAnsi="標楷體" w:cstheme="majorHAnsi" w:hint="eastAsia"/>
-              </w:rPr>
-              <w:t xml:space="preserve">（櫃檯/房務） </w:t>
-            </w:r>
-            <w:r>
-              <w:rPr>
-                <w:rFonts w:ascii="標楷體" w:eastAsia="標楷體" w:hAnsi="標楷體" w:cstheme="majorHAnsi"/>
-              </w:rPr>
-              <w:t>□</w:t>
-            </w:r>
-            <w:r>
-              <w:rPr>
-                <w:rFonts w:ascii="標楷體" w:eastAsia="標楷體" w:hAnsi="標楷體" w:cstheme="majorHAnsi" w:hint="eastAsia"/>
-              </w:rPr>
-              <w:t>製造業</w:t>
-            </w:r>
-            <w:r>
-              <w:rPr>
-                <w:rFonts w:ascii="標楷體" w:eastAsia="標楷體" w:hAnsi="標楷體" w:cstheme="majorHAnsi" w:hint="eastAsia"/>
-              </w:rPr>
-              <w:t xml:space="preserve">   </w:t>
-            </w:r>
-            <w:r>
-              <w:rPr>
-                <w:rFonts w:ascii="標楷體" w:eastAsia="標楷體" w:hAnsi="標楷體" w:cstheme="majorHAnsi"/>
-              </w:rPr>
-              <w:t>□</w:t>
-            </w:r>
-            <w:r>
-              <w:rPr>
-                <w:rFonts w:ascii="標楷體" w:eastAsia="標楷體" w:hAnsi="標楷體" w:cstheme="majorHAnsi" w:hint="eastAsia"/>
-              </w:rPr>
-              <w:t>內勤 (行政/行銷)</w:t>
-            </w:r>
-            <w:r>
-              <w:rPr>
-                <w:rFonts w:ascii="標楷體" w:eastAsia="標楷體" w:hAnsi="標楷體" w:cstheme="majorHAnsi"/>
-                <w:lang w:val="vi-VN"/>
-              </w:rPr>
-              <w:t xml:space="preserve">  </w:t>
-            </w:r>
-            <w:r>
-              <w:rPr>
-                <w:rFonts w:ascii="標楷體" w:eastAsia="標楷體" w:hAnsi="標楷體" w:cstheme="majorHAnsi"/>
-              </w:rPr>
-              <w:t>□</w:t>
-            </w:r>
-            <w:r>
-              <w:rPr>
-                <w:rFonts w:ascii="標楷體" w:eastAsia="標楷體" w:hAnsi="標楷體" w:cstheme="majorHAnsi" w:hint="eastAsia"/>
-              </w:rPr>
-              <w:t>其他</w:t>
+                <w:rFonts w:ascii="標楷體" w:eastAsia="標楷體" w:hAnsi="標楷體" w:cstheme="majorHAnsi"/>
+              </w:rPr>
+              <w:t xml:space="preserve">其他  </w:t>
             </w:r>
           </w:p>
         </w:tc>
@@ -1851,6 +1747,7 @@
           </w:tcPr>
           <w:p>
             <w:pPr>
+              <w:spacing w:after="140"/>
               <w:jc w:val="center"/>
               <w:rPr>
                 <w:rFonts w:ascii="標楷體" w:eastAsia="標楷體" w:hAnsi="標楷體" w:cstheme="majorHAnsi"/>
@@ -1869,6 +1766,7 @@
           </w:p>
           <w:p>
             <w:pPr>
+              <w:spacing w:after="140"/>
               <w:jc w:val="center"/>
               <w:rPr>
                 <w:rFonts w:ascii="標楷體" w:eastAsia="標楷體" w:hAnsi="標楷體" w:cstheme="majorHAnsi"/>
@@ -1897,11 +1795,12 @@
         <w:tc>
           <w:tcPr>
             <w:tcW w:w="8647" w:type="dxa"/>
-            <w:gridSpan w:val="7"/>
-            <w:vAlign w:val="center"/>
-          </w:tcPr>
-          <w:p>
-            <w:pPr>
+            <w:gridSpan w:val="9"/>
+            <w:vAlign w:val="center"/>
+          </w:tcPr>
+          <w:p>
+            <w:pPr>
+              <w:spacing w:after="140"/>
               <w:ind w:firstLineChars="100" w:firstLine="240"/>
               <w:rPr>
                 <w:rFonts w:ascii="標楷體" w:eastAsia="標楷體" w:hAnsi="標楷體" w:cstheme="majorHAnsi"/>
@@ -1915,9 +1814,9 @@
             </w:r>
             <w:r>
               <w:rPr>
-                <w:rFonts w:ascii="標楷體" w:eastAsia="標楷體" w:hAnsi="標楷體" w:cstheme="majorHAnsi" w:hint="eastAsia"/>
-              </w:rPr>
-              <w:t xml:space="preserve">日班   </w:t>
+                <w:rFonts w:ascii="標楷體" w:eastAsia="標楷體" w:hAnsi="標楷體" w:cstheme="majorHAnsi"/>
+              </w:rPr>
+              <w:t xml:space="preserve">日班   □中班   </w:t>
             </w:r>
             <w:r>
               <w:rPr>
@@ -1927,9 +1826,9 @@
             </w:r>
             <w:r>
               <w:rPr>
-                <w:rFonts w:ascii="標楷體" w:eastAsia="標楷體" w:hAnsi="標楷體" w:cstheme="majorHAnsi" w:hint="eastAsia"/>
-              </w:rPr>
-              <w:t xml:space="preserve">中班     </w:t>
+                <w:rFonts w:ascii="標楷體" w:eastAsia="標楷體" w:hAnsi="標楷體" w:cstheme="majorHAnsi"/>
+              </w:rPr>
+              <w:t xml:space="preserve">夜班   □輪班   </w:t>
             </w:r>
             <w:r>
               <w:rPr>
@@ -1939,33 +1838,9 @@
             </w:r>
             <w:r>
               <w:rPr>
-                <w:rFonts w:ascii="標楷體" w:eastAsia="標楷體" w:hAnsi="標楷體" w:cstheme="majorHAnsi" w:hint="eastAsia"/>
-              </w:rPr>
-              <w:t xml:space="preserve">夜班    </w:t>
-            </w:r>
-            <w:r>
-              <w:rPr>
-                <w:rFonts w:ascii="標楷體" w:eastAsia="標楷體" w:hAnsi="標楷體" w:cstheme="majorHAnsi"/>
-              </w:rPr>
-              <w:t>□</w:t>
-            </w:r>
-            <w:r>
-              <w:rPr>
-                <w:rFonts w:ascii="標楷體" w:eastAsia="標楷體" w:hAnsi="標楷體" w:cstheme="majorHAnsi" w:hint="eastAsia"/>
-              </w:rPr>
-              <w:t xml:space="preserve">輪班    </w:t>
-            </w:r>
-            <w:r>
-              <w:rPr>
-                <w:rFonts w:ascii="標楷體" w:eastAsia="標楷體" w:hAnsi="標楷體" w:cstheme="majorHAnsi"/>
-              </w:rPr>
-              <w:t>□</w:t>
-            </w:r>
-            <w:r>
-              <w:rPr>
-                <w:rFonts w:ascii="標楷體" w:eastAsia="標楷體" w:hAnsi="標楷體" w:cstheme="majorHAnsi" w:hint="eastAsia"/>
-              </w:rPr>
-              <w:t xml:space="preserve"> 都可</w:t>
+                <w:rFonts w:ascii="標楷體" w:eastAsia="標楷體" w:hAnsi="標楷體" w:cstheme="majorHAnsi"/>
+              </w:rPr>
+              <w:t>都可</w:t>
             </w:r>
           </w:p>
         </w:tc>
@@ -1982,6 +1857,7 @@
           </w:tcPr>
           <w:p>
             <w:pPr>
+              <w:spacing w:after="140"/>
               <w:jc w:val="center"/>
               <w:rPr>
                 <w:rFonts w:ascii="標楷體" w:eastAsia="標楷體" w:hAnsi="標楷體" w:cstheme="majorHAnsi"/>
@@ -2002,11 +1878,12 @@
         <w:tc>
           <w:tcPr>
             <w:tcW w:w="8647" w:type="dxa"/>
-            <w:gridSpan w:val="7"/>
-            <w:vAlign w:val="center"/>
-          </w:tcPr>
-          <w:p>
-            <w:pPr>
+            <w:gridSpan w:val="9"/>
+            <w:vAlign w:val="center"/>
+          </w:tcPr>
+          <w:p>
+            <w:pPr>
+              <w:spacing w:after="140"/>
               <w:ind w:firstLineChars="100" w:firstLine="240"/>
               <w:jc w:val="center"/>
               <w:rPr>
@@ -2020,7 +1897,8 @@
     </w:tbl>
     <w:p>
       <w:pPr>
-        <w:ind w:firstLineChars="1200" w:firstLine="2880"/>
+        <w:spacing w:after="140"/>
+        <w:ind w:firstLineChars="1550" w:firstLine="3720"/>
         <w:rPr>
           <w:rFonts w:ascii="標楷體" w:eastAsia="標楷體" w:hAnsi="標楷體"/>
         </w:rPr>
@@ -2029,7 +1907,33 @@
         <w:rPr>
           <w:rFonts w:ascii="標楷體" w:eastAsia="標楷體" w:hAnsi="標楷體"/>
         </w:rPr>
-        <w:t>填寫日期：________年________月______日</w:t>
+        <w:t>填寫日期：</w:t>
+      </w:r>
+      <w:r>
+        <w:rPr>
+          <w:rFonts w:ascii="標楷體" w:eastAsia="DengXian" w:hAnsi="標楷體" w:hint="eastAsia"/>
+          <w:lang w:eastAsia="zh-CN"/>
+        </w:rPr>
+        <w:t xml:space="preserve">  </w:t>
+      </w:r>
+      <w:r>
+        <w:rPr>
+          <w:rFonts w:ascii="標楷體" w:eastAsia="標楷體" w:hAnsi="標楷體"/>
+        </w:rPr>
+        <w:t>年</w:t>
+      </w:r>
+      <w:r>
+        <w:rPr>
+          <w:rFonts w:ascii="標楷體" w:eastAsia="DengXian" w:hAnsi="標楷體" w:hint="eastAsia"/>
+          <w:lang w:eastAsia="zh-CN"/>
+        </w:rPr>
+        <w:t xml:space="preserve">    </w:t>
+      </w:r>
+      <w:r>
+        <w:rPr>
+          <w:rFonts w:ascii="標楷體" w:eastAsia="標楷體" w:hAnsi="標楷體"/>
+        </w:rPr>
+        <w:t>月日</w:t>
       </w:r>
     </w:p>
     <w:sectPr>
@@ -2043,7 +1947,7 @@
 </file>
 
 <file path=word/endnotes.xml><?xml version="1.0" encoding="utf-8"?>
-<w:endnotes xmlns:wpc="http://schemas.microsoft.com/office/word/2010/wordprocessingCanvas" xmlns:cx="http://schemas.microsoft.com/office/drawing/2014/chartex" xmlns:cx1="http://schemas.microsoft.com/office/drawing/2015/9/8/chartex" xmlns:cx2="http://schemas.microsoft.com/office/drawing/2015/10/21/chartex" xmlns:cx3="http://schemas.microsoft.com/office/drawing/2016/5/9/chartex" xmlns:cx4="http://schemas.microsoft.com/office/drawing/2016/5/10/chartex" xmlns:cx5="http://schemas.microsoft.com/office/drawing/2016/5/11/chartex" xmlns:cx6="http://schemas.microsoft.com/office/drawing/2016/5/12/chartex" xmlns:cx7="http://schemas.microsoft.com/office/drawing/2016/5/13/chartex" xmlns:cx8="http://schemas.microsoft.com/office/drawing/2016/5/14/chartex" xmlns:mc="http://schemas.openxmlformats.org/markup-compatibility/2006" xmlns:aink="http://schemas.microsoft.com/office/drawing/2016/ink" xmlns:am3d="http://schemas.microsoft.com/office/drawing/2017/model3d" xmlns:o="urn:schemas-microsoft-com:office:office" xmlns:oel="http://schemas.microsoft.com/office/2019/extlst" xmlns:r="http://schemas.openxmlformats.org/officeDocument/2006/relationships" xmlns:m="http://schemas.openxmlformats.org/officeDocument/2006/math" xmlns:v="urn:schemas-microsoft-com:vml" xmlns:wp14="http://schemas.microsoft.com/office/word/2010/wordprocessingDrawing" xmlns:wp="http://schemas.openxmlformats.org/drawingml/2006/wordprocessingDrawing" xmlns:w10="urn:schemas-microsoft-com:office:word" xmlns:w="http://schemas.openxmlformats.org/wordprocessingml/2006/main" xmlns:w14="http://schemas.microsoft.com/office/word/2010/wordml" xmlns:w15="http://schemas.microsoft.com/office/word/2012/wordml" xmlns:w16cex="http://schemas.microsoft.com/office/word/2018/wordml/cex" xmlns:w16cid="http://schemas.microsoft.com/office/word/2016/wordml/cid" xmlns:w16="http://schemas.microsoft.com/office/word/2018/wordml" xmlns:w16du="http://schemas.microsoft.com/office/word/2023/wordml/word16du" xmlns:w16sdtdh="http://schemas.microsoft.com/office/word/2020/wordml/sdtdatahash" xmlns:w16sdtfl="http://schemas.microsoft.com/office/word/2024/wordml/sdtformatlock" xmlns:w16se="http://schemas.microsoft.com/office/word/2015/wordml/symex" xmlns:wpg="http://schemas.microsoft.com/office/word/2010/wordprocessingGroup" xmlns:wpi="http://schemas.microsoft.com/office/word/2010/wordprocessingInk" xmlns:wne="http://schemas.microsoft.com/office/word/2006/wordml" xmlns:wps="http://schemas.microsoft.com/office/word/2010/wordprocessingShape" mc:Ignorable="w14 w15 w16se w16cid w16 w16cex w16sdtdh w16sdtfl w16du wp14">
+<w:endnotes xmlns:wpc="http://schemas.microsoft.com/office/word/2010/wordprocessingCanvas" xmlns:cx="http://schemas.microsoft.com/office/drawing/2014/chartex" xmlns:cx1="http://schemas.microsoft.com/office/drawing/2015/9/8/chartex" xmlns:cx2="http://schemas.microsoft.com/office/drawing/2015/10/21/chartex" xmlns:cx3="http://schemas.microsoft.com/office/drawing/2016/5/9/chartex" xmlns:cx4="http://schemas.microsoft.com/office/drawing/2016/5/10/chartex" xmlns:cx5="http://schemas.microsoft.com/office/drawing/2016/5/11/chartex" xmlns:cx6="http://schemas.microsoft.com/office/drawing/2016/5/12/chartex" xmlns:cx7="http://schemas.microsoft.com/office/drawing/2016/5/13/chartex" xmlns:cx8="http://schemas.microsoft.com/office/drawing/2016/5/14/chartex" xmlns:mc="http://schemas.openxmlformats.org/markup-compatibility/2006" xmlns:aink="http://schemas.microsoft.com/office/drawing/2016/ink" xmlns:am3d="http://schemas.microsoft.com/office/drawing/2017/model3d" xmlns:o="urn:schemas-microsoft-com:office:office" xmlns:oel="http://schemas.microsoft.com/office/2019/extlst" xmlns:r="http://schemas.openxmlformats.org/officeDocument/2006/relationships" xmlns:m="http://schemas.openxmlformats.org/officeDocument/2006/math" xmlns:v="urn:schemas-microsoft-com:vml" xmlns:wp14="http://schemas.microsoft.com/office/word/2010/wordprocessingDrawing" xmlns:wp="http://schemas.openxmlformats.org/drawingml/2006/wordprocessingDrawing" xmlns:w10="urn:schemas-microsoft-com:office:word" xmlns:w="http://schemas.openxmlformats.org/wordprocessingml/2006/main" xmlns:w14="http://schemas.microsoft.com/office/word/2010/wordml" xmlns:w15="http://schemas.microsoft.com/office/word/2012/wordml" xmlns:w16cex="http://schemas.microsoft.com/office/word/2018/wordml/cex" xmlns:w16cid="http://schemas.microsoft.com/office/word/2016/wordml/cid" xmlns:w16="http://schemas.microsoft.com/office/word/2018/wordml" xmlns:w16sdtdh="http://schemas.microsoft.com/office/word/2020/wordml/sdtdatahash" xmlns:w16se="http://schemas.microsoft.com/office/word/2015/wordml/symex" xmlns:wpg="http://schemas.microsoft.com/office/word/2010/wordprocessingGroup" xmlns:wpi="http://schemas.microsoft.com/office/word/2010/wordprocessingInk" xmlns:wne="http://schemas.microsoft.com/office/word/2006/wordml" xmlns:wps="http://schemas.microsoft.com/office/word/2010/wordprocessingShape" mc:Ignorable="w14 w15 w16se w16cid w16 w16cex w16sdtdh wp14">
   <w:endnote w:type="separator" w:id="-1">
     <w:p>
       <w:pPr>
@@ -2068,7 +1972,7 @@
 </file>
 
 <file path=word/footnotes.xml><?xml version="1.0" encoding="utf-8"?>
-<w:footnotes xmlns:wpc="http://schemas.microsoft.com/office/word/2010/wordprocessingCanvas" xmlns:cx="http://schemas.microsoft.com/office/drawing/2014/chartex" xmlns:cx1="http://schemas.microsoft.com/office/drawing/2015/9/8/chartex" xmlns:cx2="http://schemas.microsoft.com/office/drawing/2015/10/21/chartex" xmlns:cx3="http://schemas.microsoft.com/office/drawing/2016/5/9/chartex" xmlns:cx4="http://schemas.microsoft.com/office/drawing/2016/5/10/chartex" xmlns:cx5="http://schemas.microsoft.com/office/drawing/2016/5/11/chartex" xmlns:cx6="http://schemas.microsoft.com/office/drawing/2016/5/12/chartex" xmlns:cx7="http://schemas.microsoft.com/office/drawing/2016/5/13/chartex" xmlns:cx8="http://schemas.microsoft.com/office/drawing/2016/5/14/chartex" xmlns:mc="http://schemas.openxmlformats.org/markup-compatibility/2006" xmlns:aink="http://schemas.microsoft.com/office/drawing/2016/ink" xmlns:am3d="http://schemas.microsoft.com/office/drawing/2017/model3d" xmlns:o="urn:schemas-microsoft-com:office:office" xmlns:oel="http://schemas.microsoft.com/office/2019/extlst" xmlns:r="http://schemas.openxmlformats.org/officeDocument/2006/relationships" xmlns:m="http://schemas.openxmlformats.org/officeDocument/2006/math" xmlns:v="urn:schemas-microsoft-com:vml" xmlns:wp14="http://schemas.microsoft.com/office/word/2010/wordprocessingDrawing" xmlns:wp="http://schemas.openxmlformats.org/drawingml/2006/wordprocessingDrawing" xmlns:w10="urn:schemas-microsoft-com:office:word" xmlns:w="http://schemas.openxmlformats.org/wordprocessingml/2006/main" xmlns:w14="http://schemas.microsoft.com/office/word/2010/wordml" xmlns:w15="http://schemas.microsoft.com/office/word/2012/wordml" xmlns:w16cex="http://schemas.microsoft.com/office/word/2018/wordml/cex" xmlns:w16cid="http://schemas.microsoft.com/office/word/2016/wordml/cid" xmlns:w16="http://schemas.microsoft.com/office/word/2018/wordml" xmlns:w16du="http://schemas.microsoft.com/office/word/2023/wordml/word16du" xmlns:w16sdtdh="http://schemas.microsoft.com/office/word/2020/wordml/sdtdatahash" xmlns:w16sdtfl="http://schemas.microsoft.com/office/word/2024/wordml/sdtformatlock" xmlns:w16se="http://schemas.microsoft.com/office/word/2015/wordml/symex" xmlns:wpg="http://schemas.microsoft.com/office/word/2010/wordprocessingGroup" xmlns:wpi="http://schemas.microsoft.com/office/word/2010/wordprocessingInk" xmlns:wne="http://schemas.microsoft.com/office/word/2006/wordml" xmlns:wps="http://schemas.microsoft.com/office/word/2010/wordprocessingShape" mc:Ignorable="w14 w15 w16se w16cid w16 w16cex w16sdtdh w16sdtfl w16du wp14">
+<w:footnotes xmlns:wpc="http://schemas.microsoft.com/office/word/2010/wordprocessingCanvas" xmlns:cx="http://schemas.microsoft.com/office/drawing/2014/chartex" xmlns:cx1="http://schemas.microsoft.com/office/drawing/2015/9/8/chartex" xmlns:cx2="http://schemas.microsoft.com/office/drawing/2015/10/21/chartex" xmlns:cx3="http://schemas.microsoft.com/office/drawing/2016/5/9/chartex" xmlns:cx4="http://schemas.microsoft.com/office/drawing/2016/5/10/chartex" xmlns:cx5="http://schemas.microsoft.com/office/drawing/2016/5/11/chartex" xmlns:cx6="http://schemas.microsoft.com/office/drawing/2016/5/12/chartex" xmlns:cx7="http://schemas.microsoft.com/office/drawing/2016/5/13/chartex" xmlns:cx8="http://schemas.microsoft.com/office/drawing/2016/5/14/chartex" xmlns:mc="http://schemas.openxmlformats.org/markup-compatibility/2006" xmlns:aink="http://schemas.microsoft.com/office/drawing/2016/ink" xmlns:am3d="http://schemas.microsoft.com/office/drawing/2017/model3d" xmlns:o="urn:schemas-microsoft-com:office:office" xmlns:oel="http://schemas.microsoft.com/office/2019/extlst" xmlns:r="http://schemas.openxmlformats.org/officeDocument/2006/relationships" xmlns:m="http://schemas.openxmlformats.org/officeDocument/2006/math" xmlns:v="urn:schemas-microsoft-com:vml" xmlns:wp14="http://schemas.microsoft.com/office/word/2010/wordprocessingDrawing" xmlns:wp="http://schemas.openxmlformats.org/drawingml/2006/wordprocessingDrawing" xmlns:w10="urn:schemas-microsoft-com:office:word" xmlns:w="http://schemas.openxmlformats.org/wordprocessingml/2006/main" xmlns:w14="http://schemas.microsoft.com/office/word/2010/wordml" xmlns:w15="http://schemas.microsoft.com/office/word/2012/wordml" xmlns:w16cex="http://schemas.microsoft.com/office/word/2018/wordml/cex" xmlns:w16cid="http://schemas.microsoft.com/office/word/2016/wordml/cid" xmlns:w16="http://schemas.microsoft.com/office/word/2018/wordml" xmlns:w16sdtdh="http://schemas.microsoft.com/office/word/2020/wordml/sdtdatahash" xmlns:w16se="http://schemas.microsoft.com/office/word/2015/wordml/symex" xmlns:wpg="http://schemas.microsoft.com/office/word/2010/wordprocessingGroup" xmlns:wpi="http://schemas.microsoft.com/office/word/2010/wordprocessingInk" xmlns:wne="http://schemas.microsoft.com/office/word/2006/wordml" xmlns:wps="http://schemas.microsoft.com/office/word/2010/wordprocessingShape" mc:Ignorable="w14 w15 w16se w16cid w16 w16cex w16sdtdh wp14">
   <w:footnote w:type="separator" w:id="-1">
     <w:p>
       <w:pPr>
@@ -2093,7 +1997,7 @@
 </file>
 
 <file path=word/styles.xml><?xml version="1.0" encoding="utf-8"?>
-<w:styles xmlns:mc="http://schemas.openxmlformats.org/markup-compatibility/2006" xmlns:r="http://schemas.openxmlformats.org/officeDocument/2006/relationships" xmlns:w="http://schemas.openxmlformats.org/wordprocessingml/2006/main" xmlns:w14="http://schemas.microsoft.com/office/word/2010/wordml" xmlns:w15="http://schemas.microsoft.com/office/word/2012/wordml" xmlns:w16cex="http://schemas.microsoft.com/office/word/2018/wordml/cex" xmlns:w16cid="http://schemas.microsoft.com/office/word/2016/wordml/cid" xmlns:w16="http://schemas.microsoft.com/office/word/2018/wordml" xmlns:w16du="http://schemas.microsoft.com/office/word/2023/wordml/word16du" xmlns:w16sdtdh="http://schemas.microsoft.com/office/word/2020/wordml/sdtdatahash" xmlns:w16sdtfl="http://schemas.microsoft.com/office/word/2024/wordml/sdtformatlock" xmlns:w16se="http://schemas.microsoft.com/office/word/2015/wordml/symex" mc:Ignorable="w14 w15 w16se w16cid w16 w16cex w16sdtdh w16sdtfl w16du">
+<w:styles xmlns:mc="http://schemas.openxmlformats.org/markup-compatibility/2006" xmlns:r="http://schemas.openxmlformats.org/officeDocument/2006/relationships" xmlns:w="http://schemas.openxmlformats.org/wordprocessingml/2006/main" xmlns:w14="http://schemas.microsoft.com/office/word/2010/wordml" xmlns:w15="http://schemas.microsoft.com/office/word/2012/wordml" xmlns:w16cex="http://schemas.microsoft.com/office/word/2018/wordml/cex" xmlns:w16cid="http://schemas.microsoft.com/office/word/2016/wordml/cid" xmlns:w16="http://schemas.microsoft.com/office/word/2018/wordml" xmlns:w16sdtdh="http://schemas.microsoft.com/office/word/2020/wordml/sdtdatahash" xmlns:w16se="http://schemas.microsoft.com/office/word/2015/wordml/symex" mc:Ignorable="w14 w15 w16se w16cid w16 w16cex w16sdtdh">
   <w:docDefaults>
     <w:rPrDefault>
       <w:rPr>
@@ -2697,6 +2601,7 @@
   <w:style w:type="character" w:default="1" w:styleId="a0">
     <w:name w:val="Default Paragraph Font"/>
     <w:uiPriority w:val="1"/>
+    <w:semiHidden/>
     <w:unhideWhenUsed/>
   </w:style>
   <w:style w:type="table" w:default="1" w:styleId="a1">

</xml_diff>